<commit_message>
Fluency Lab worksheets, Module 3: fewer words
Co-Authored-By: Claude Opus 5.5 <noreply@anthropic.com>
Claude-Session: https://claude.ai/code/session_014YTiyifGRnSLg5sxKHwHzH
</commit_message>
<xml_diff>
--- a/grade8/Fluency-Lab-Package/module-materials/Module-3-Divide/FluencyLab_M3_Facts.docx
+++ b/grade8/Fluency-Lab-Package/module-materials/Module-3-Divide/FluencyLab_M3_Facts.docx
@@ -49,6 +49,9 @@
         <w:gridCol w:w="5960"/>
       </w:tblGrid>
       <w:tr>
+        <w:trPr>
+          <w:cantSplit/>
+        </w:trPr>
         <w:tc>
           <w:tcPr>
             <w:tcW w:type="dxa" w:w="3400"/>
@@ -136,7 +139,7 @@
           <w:sz w:val="26"/>
           <w:szCs w:val="26"/>
         </w:rPr>
-        <w:t xml:space="preserve">The one idea</w:t>
+        <w:t xml:space="preserve">Worked example</w:t>
       </w:r>
     </w:p>
     <w:tbl>
@@ -155,6 +158,9 @@
         <w:gridCol w:w="9360"/>
       </w:tblGrid>
       <w:tr>
+        <w:trPr>
+          <w:cantSplit/>
+        </w:trPr>
         <w:tc>
           <w:tcPr>
             <w:tcW w:type="dxa" w:w="9360"/>
@@ -181,7 +187,7 @@
                 <w:sz w:val="22"/>
                 <w:szCs w:val="22"/>
               </w:rPr>
-              <w:t xml:space="preserve">Every division fact is a multiplication fact in reverse.</w:t>
+              <w:t xml:space="preserve">Division is multiplication backwards.</w:t>
             </w:r>
           </w:p>
           <w:p>
@@ -194,7 +200,7 @@
                 <w:sz w:val="24"/>
                 <w:szCs w:val="24"/>
               </w:rPr>
-              <w:t xml:space="preserve">56 ÷ 7 = 8   because   7 × 8 = 56.</w:t>
+              <w:t xml:space="preserve">56 ÷ 7 = 8   because   7 × 8 = 56</w:t>
             </w:r>
           </w:p>
           <w:p>
@@ -203,10 +209,11 @@
             </w:pPr>
             <w:r>
               <w:rPr>
-                <w:sz w:val="21"/>
-                <w:szCs w:val="21"/>
-              </w:rPr>
-              <w:t xml:space="preserve">Stuck on  63 ÷ 9 ?  Ask: 9 times what is 63?  →  7.</w:t>
+                <w:rFonts w:ascii="Consolas" w:cs="Consolas" w:eastAsia="Consolas" w:hAnsi="Consolas"/>
+                <w:sz w:val="24"/>
+                <w:szCs w:val="24"/>
+              </w:rPr>
+              <w:t xml:space="preserve">63 ÷ 9 = ?   Think: 9 × ? = 63  →  7</w:t>
             </w:r>
           </w:p>
         </w:tc>
@@ -238,7 +245,7 @@
           <w:sz w:val="22"/>
           <w:szCs w:val="22"/>
         </w:rPr>
-        <w:t xml:space="preserve">Each trio of numbers makes four facts. Fill them in.</w:t>
+        <w:t xml:space="preserve">Fill in all four facts.</w:t>
       </w:r>
     </w:p>
     <w:tbl>
@@ -257,6 +264,9 @@
         <w:gridCol w:w="9360"/>
       </w:tblGrid>
       <w:tr>
+        <w:trPr>
+          <w:cantSplit/>
+        </w:trPr>
         <w:tc>
           <w:tcPr>
             <w:tcW w:type="dxa" w:w="9360"/>
@@ -332,6 +342,9 @@
         <w:gridCol w:w="9360"/>
       </w:tblGrid>
       <w:tr>
+        <w:trPr>
+          <w:cantSplit/>
+        </w:trPr>
         <w:tc>
           <w:tcPr>
             <w:tcW w:type="dxa" w:w="9360"/>
@@ -407,6 +420,9 @@
         <w:gridCol w:w="9360"/>
       </w:tblGrid>
       <w:tr>
+        <w:trPr>
+          <w:cantSplit/>
+        </w:trPr>
         <w:tc>
           <w:tcPr>
             <w:tcW w:type="dxa" w:w="9360"/>
@@ -479,7 +495,7 @@
           <w:sz w:val="26"/>
           <w:szCs w:val="26"/>
         </w:rPr>
-        <w:t xml:space="preserve">On your own — mixed facts</w:t>
+        <w:t xml:space="preserve">On your own</w:t>
       </w:r>
     </w:p>
     <w:tbl>
@@ -500,6 +516,9 @@
         <w:gridCol w:w="3120"/>
       </w:tblGrid>
       <w:tr>
+        <w:trPr>
+          <w:cantSplit/>
+        </w:trPr>
         <w:tc>
           <w:tcPr>
             <w:tcW w:type="dxa" w:w="3120"/>
@@ -592,6 +611,9 @@
         </w:tc>
       </w:tr>
       <w:tr>
+        <w:trPr>
+          <w:cantSplit/>
+        </w:trPr>
         <w:tc>
           <w:tcPr>
             <w:tcW w:type="dxa" w:w="3120"/>
@@ -684,6 +706,9 @@
         </w:tc>
       </w:tr>
       <w:tr>
+        <w:trPr>
+          <w:cantSplit/>
+        </w:trPr>
         <w:tc>
           <w:tcPr>
             <w:tcW w:type="dxa" w:w="3120"/>
@@ -776,6 +801,9 @@
         </w:tc>
       </w:tr>
       <w:tr>
+        <w:trPr>
+          <w:cantSplit/>
+        </w:trPr>
         <w:tc>
           <w:tcPr>
             <w:tcW w:type="dxa" w:w="3120"/>
@@ -880,7 +908,7 @@
           <w:sz w:val="20"/>
           <w:szCs w:val="20"/>
         </w:rPr>
-        <w:t xml:space="preserve">When a division fact won’t come, reach for its multiplication twin. ★</w:t>
+        <w:t xml:space="preserve">Think multiplication backwards. ★</w:t>
       </w:r>
     </w:p>
     <w:sectPr>

</xml_diff>